<commit_message>
Clean starter scaffolding and tighten GitHub readiness
</commit_message>
<xml_diff>
--- a/PROJECT_HANDOFF_2026-04-14.docx
+++ b/PROJECT_HANDOFF_2026-04-14.docx
@@ -133,6 +133,15 @@
           <w:szCs w:val="22"/>
         </w:rPr>
         <w:t xml:space="preserve">- Expo patch versions were refreshed so `npm run doctor` passes cleanly again</w:t>
+      </w:r>
+    </w:p>
+    <w:p>
+      <w:r>
+        <w:rPr>
+          <w:sz w:val="22"/>
+          <w:szCs w:val="22"/>
+        </w:rPr>
+        <w:t xml:space="preserve">- GitHub dependency-review workflow now skips with a warning instead of failing red when repository dependency graph support is unavailable</w:t>
       </w:r>
     </w:p>
     <w:p/>

</xml_diff>